<commit_message>
New File Added and Another Files Modified
</commit_message>
<xml_diff>
--- a/Online_Book_Store_Report.docx
+++ b/Online_Book_Store_Report.docx
@@ -126,7 +126,7 @@
         <w:pStyle w:val="ListParagraph"/>
         <w:numPr>
           <w:ilvl w:val="0"/>
-          <w:numId w:val="1"/>
+          <w:numId w:val="2"/>
         </w:numPr>
         <w:jc w:val="both"/>
         <w:rPr>
@@ -147,7 +147,7 @@
         <w:pStyle w:val="ListParagraph"/>
         <w:numPr>
           <w:ilvl w:val="0"/>
-          <w:numId w:val="1"/>
+          <w:numId w:val="2"/>
         </w:numPr>
         <w:jc w:val="both"/>
         <w:rPr>
@@ -168,7 +168,7 @@
         <w:pStyle w:val="ListParagraph"/>
         <w:numPr>
           <w:ilvl w:val="0"/>
-          <w:numId w:val="1"/>
+          <w:numId w:val="2"/>
         </w:numPr>
         <w:jc w:val="both"/>
         <w:rPr>
@@ -189,7 +189,7 @@
         <w:pStyle w:val="ListParagraph"/>
         <w:numPr>
           <w:ilvl w:val="0"/>
-          <w:numId w:val="1"/>
+          <w:numId w:val="2"/>
         </w:numPr>
         <w:jc w:val="both"/>
         <w:rPr>
@@ -210,7 +210,7 @@
         <w:pStyle w:val="ListParagraph"/>
         <w:numPr>
           <w:ilvl w:val="0"/>
-          <w:numId w:val="1"/>
+          <w:numId w:val="2"/>
         </w:numPr>
         <w:jc w:val="both"/>
         <w:rPr>
@@ -231,7 +231,7 @@
         <w:pStyle w:val="ListParagraph"/>
         <w:numPr>
           <w:ilvl w:val="0"/>
-          <w:numId w:val="1"/>
+          <w:numId w:val="2"/>
         </w:numPr>
         <w:jc w:val="both"/>
         <w:rPr>
@@ -252,7 +252,7 @@
         <w:pStyle w:val="ListParagraph"/>
         <w:numPr>
           <w:ilvl w:val="0"/>
-          <w:numId w:val="1"/>
+          <w:numId w:val="2"/>
         </w:numPr>
         <w:jc w:val="both"/>
         <w:rPr>
@@ -273,7 +273,7 @@
         <w:pStyle w:val="ListParagraph"/>
         <w:numPr>
           <w:ilvl w:val="0"/>
-          <w:numId w:val="1"/>
+          <w:numId w:val="2"/>
         </w:numPr>
         <w:jc w:val="both"/>
         <w:rPr>
@@ -294,8 +294,328 @@
         <w:pStyle w:val="ListParagraph"/>
         <w:numPr>
           <w:ilvl w:val="0"/>
-          <w:numId w:val="1"/>
+          <w:numId w:val="2"/>
         </w:numPr>
+        <w:jc w:val="both"/>
+        <w:rPr>
+          <w:sz w:val="28"/>
+          <w:szCs w:val="28"/>
+        </w:rPr>
+      </w:pPr>
+      <w:r>
+        <w:rPr>
+          <w:sz w:val="28"/>
+          <w:szCs w:val="28"/>
+        </w:rPr>
+        <w:t>List all genres available in the Books table.</w:t>
+      </w:r>
+    </w:p>
+    <w:p>
+      <w:pPr>
+        <w:pStyle w:val="ListParagraph"/>
+        <w:numPr>
+          <w:ilvl w:val="0"/>
+          <w:numId w:val="2"/>
+        </w:numPr>
+        <w:jc w:val="both"/>
+        <w:rPr>
+          <w:sz w:val="28"/>
+          <w:szCs w:val="28"/>
+        </w:rPr>
+      </w:pPr>
+      <w:r>
+        <w:rPr>
+          <w:sz w:val="28"/>
+          <w:szCs w:val="28"/>
+        </w:rPr>
+        <w:t>Find the book with the lowest stock.</w:t>
+      </w:r>
+    </w:p>
+    <w:p>
+      <w:pPr>
+        <w:pStyle w:val="ListParagraph"/>
+        <w:numPr>
+          <w:ilvl w:val="0"/>
+          <w:numId w:val="2"/>
+        </w:numPr>
+        <w:jc w:val="both"/>
+        <w:rPr>
+          <w:sz w:val="28"/>
+          <w:szCs w:val="28"/>
+        </w:rPr>
+      </w:pPr>
+      <w:r>
+        <w:rPr>
+          <w:sz w:val="28"/>
+          <w:szCs w:val="28"/>
+        </w:rPr>
+        <w:t>Calculate total revenue generated from all orders.</w:t>
+      </w:r>
+    </w:p>
+    <w:p>
+      <w:pPr>
+        <w:pStyle w:val="ListParagraph"/>
+        <w:jc w:val="both"/>
+        <w:rPr>
+          <w:b/>
+          <w:bCs/>
+          <w:sz w:val="32"/>
+          <w:szCs w:val="32"/>
+          <w:u w:val="single"/>
+        </w:rPr>
+      </w:pPr>
+    </w:p>
+    <w:p>
+      <w:pPr>
+        <w:jc w:val="both"/>
+        <w:rPr>
+          <w:b/>
+          <w:bCs/>
+          <w:sz w:val="32"/>
+          <w:szCs w:val="32"/>
+          <w:u w:val="single"/>
+        </w:rPr>
+      </w:pPr>
+      <w:r>
+        <w:rPr>
+          <w:b/>
+          <w:bCs/>
+          <w:sz w:val="32"/>
+          <w:szCs w:val="32"/>
+          <w:u w:val="single"/>
+        </w:rPr>
+        <w:t>Advanced Queries</w:t>
+      </w:r>
+    </w:p>
+    <w:p>
+      <w:pPr>
+        <w:pStyle w:val="ListParagraph"/>
+        <w:numPr>
+          <w:ilvl w:val="0"/>
+          <w:numId w:val="3"/>
+        </w:numPr>
+        <w:jc w:val="both"/>
+        <w:rPr>
+          <w:b/>
+          <w:bCs/>
+          <w:sz w:val="32"/>
+          <w:szCs w:val="32"/>
+        </w:rPr>
+      </w:pPr>
+      <w:r>
+        <w:rPr>
+          <w:sz w:val="32"/>
+          <w:szCs w:val="32"/>
+        </w:rPr>
+        <w:t>Retrieve the total number of books sold for each genre</w:t>
+      </w:r>
+      <w:r>
+        <w:rPr>
+          <w:b/>
+          <w:bCs/>
+          <w:sz w:val="32"/>
+          <w:szCs w:val="32"/>
+        </w:rPr>
+        <w:t>.</w:t>
+      </w:r>
+    </w:p>
+    <w:p>
+      <w:pPr>
+        <w:pStyle w:val="ListParagraph"/>
+        <w:numPr>
+          <w:ilvl w:val="0"/>
+          <w:numId w:val="3"/>
+        </w:numPr>
+        <w:jc w:val="both"/>
+        <w:rPr>
+          <w:b/>
+          <w:bCs/>
+          <w:sz w:val="32"/>
+          <w:szCs w:val="32"/>
+        </w:rPr>
+      </w:pPr>
+      <w:r>
+        <w:rPr>
+          <w:sz w:val="32"/>
+          <w:szCs w:val="32"/>
+        </w:rPr>
+        <w:t>Find the average price of books in the “Fantasy” genre.</w:t>
+      </w:r>
+    </w:p>
+    <w:p>
+      <w:pPr>
+        <w:pStyle w:val="ListParagraph"/>
+        <w:numPr>
+          <w:ilvl w:val="0"/>
+          <w:numId w:val="3"/>
+        </w:numPr>
+        <w:jc w:val="both"/>
+        <w:rPr>
+          <w:b/>
+          <w:bCs/>
+          <w:sz w:val="32"/>
+          <w:szCs w:val="32"/>
+        </w:rPr>
+      </w:pPr>
+      <w:r>
+        <w:rPr>
+          <w:sz w:val="32"/>
+          <w:szCs w:val="32"/>
+        </w:rPr>
+        <w:t>List customers who placed at least 2 orders.</w:t>
+      </w:r>
+    </w:p>
+    <w:p>
+      <w:pPr>
+        <w:pStyle w:val="ListParagraph"/>
+        <w:numPr>
+          <w:ilvl w:val="0"/>
+          <w:numId w:val="3"/>
+        </w:numPr>
+        <w:jc w:val="both"/>
+        <w:rPr>
+          <w:b/>
+          <w:bCs/>
+          <w:sz w:val="32"/>
+          <w:szCs w:val="32"/>
+        </w:rPr>
+      </w:pPr>
+      <w:r>
+        <w:rPr>
+          <w:sz w:val="32"/>
+          <w:szCs w:val="32"/>
+        </w:rPr>
+        <w:t>Find the most frequent ordered book.</w:t>
+      </w:r>
+    </w:p>
+    <w:p>
+      <w:pPr>
+        <w:pStyle w:val="ListParagraph"/>
+        <w:numPr>
+          <w:ilvl w:val="0"/>
+          <w:numId w:val="3"/>
+        </w:numPr>
+        <w:jc w:val="both"/>
+        <w:rPr>
+          <w:b/>
+          <w:bCs/>
+          <w:sz w:val="32"/>
+          <w:szCs w:val="32"/>
+        </w:rPr>
+      </w:pPr>
+      <w:r>
+        <w:rPr>
+          <w:sz w:val="32"/>
+          <w:szCs w:val="32"/>
+        </w:rPr>
+        <w:t>Show the top 3 most expensive books of ‘Fantasy’ genre.</w:t>
+      </w:r>
+    </w:p>
+    <w:p>
+      <w:pPr>
+        <w:pStyle w:val="ListParagraph"/>
+        <w:numPr>
+          <w:ilvl w:val="0"/>
+          <w:numId w:val="3"/>
+        </w:numPr>
+        <w:jc w:val="both"/>
+        <w:rPr>
+          <w:b/>
+          <w:bCs/>
+          <w:sz w:val="32"/>
+          <w:szCs w:val="32"/>
+        </w:rPr>
+      </w:pPr>
+      <w:r>
+        <w:rPr>
+          <w:sz w:val="32"/>
+          <w:szCs w:val="32"/>
+        </w:rPr>
+        <w:t>Retrieve the total quantity of books sold by each author.</w:t>
+      </w:r>
+    </w:p>
+    <w:p>
+      <w:pPr>
+        <w:pStyle w:val="ListParagraph"/>
+        <w:numPr>
+          <w:ilvl w:val="0"/>
+          <w:numId w:val="3"/>
+        </w:numPr>
+        <w:jc w:val="both"/>
+        <w:rPr>
+          <w:b/>
+          <w:bCs/>
+          <w:sz w:val="32"/>
+          <w:szCs w:val="32"/>
+        </w:rPr>
+      </w:pPr>
+      <w:r>
+        <w:rPr>
+          <w:sz w:val="32"/>
+          <w:szCs w:val="32"/>
+        </w:rPr>
+        <w:t xml:space="preserve">List the cities where customers who spent over $ 30 </w:t>
+      </w:r>
+    </w:p>
+    <w:p>
+      <w:pPr>
+        <w:pStyle w:val="ListParagraph"/>
+        <w:numPr>
+          <w:ilvl w:val="0"/>
+          <w:numId w:val="3"/>
+        </w:numPr>
+        <w:jc w:val="both"/>
+        <w:rPr>
+          <w:b/>
+          <w:bCs/>
+          <w:sz w:val="32"/>
+          <w:szCs w:val="32"/>
+        </w:rPr>
+      </w:pPr>
+      <w:r>
+        <w:rPr>
+          <w:sz w:val="32"/>
+          <w:szCs w:val="32"/>
+        </w:rPr>
+        <w:t>Find the customer who spent the most on orders.</w:t>
+      </w:r>
+    </w:p>
+    <w:p>
+      <w:pPr>
+        <w:pStyle w:val="ListParagraph"/>
+        <w:numPr>
+          <w:ilvl w:val="0"/>
+          <w:numId w:val="3"/>
+        </w:numPr>
+        <w:jc w:val="both"/>
+        <w:rPr>
+          <w:b/>
+          <w:bCs/>
+          <w:sz w:val="32"/>
+          <w:szCs w:val="32"/>
+        </w:rPr>
+      </w:pPr>
+      <w:r>
+        <w:rPr>
+          <w:sz w:val="32"/>
+          <w:szCs w:val="32"/>
+        </w:rPr>
+        <w:t>Calculate the stock remaining after fulfilling all orders.</w:t>
+      </w:r>
+    </w:p>
+    <w:p>
+      <w:pPr>
+        <w:jc w:val="both"/>
+        <w:rPr>
+          <w:b/>
+          <w:bCs/>
+          <w:sz w:val="32"/>
+          <w:szCs w:val="32"/>
+        </w:rPr>
+      </w:pPr>
+    </w:p>
+    <w:p>
+      <w:pPr>
         <w:jc w:val="both"/>
         <w:rPr>
           <w:sz w:val="28"/>
@@ -396,6 +716,32 @@
 
 <file path=word/numbering.xml><?xml version="1.0" encoding="utf-8"?>
 <w:numbering xmlns:wpc="http://schemas.microsoft.com/office/word/2010/wordprocessingCanvas" xmlns:cx="http://schemas.microsoft.com/office/drawing/2014/chartex" xmlns:cx1="http://schemas.microsoft.com/office/drawing/2015/9/8/chartex" xmlns:cx2="http://schemas.microsoft.com/office/drawing/2015/10/21/chartex" xmlns:cx3="http://schemas.microsoft.com/office/drawing/2016/5/9/chartex" xmlns:cx4="http://schemas.microsoft.com/office/drawing/2016/5/10/chartex" xmlns:cx5="http://schemas.microsoft.com/office/drawing/2016/5/11/chartex" xmlns:cx6="http://schemas.microsoft.com/office/drawing/2016/5/12/chartex" xmlns:cx7="http://schemas.microsoft.com/office/drawing/2016/5/13/chartex" xmlns:cx8="http://schemas.microsoft.com/office/drawing/2016/5/14/chartex" xmlns:mc="http://schemas.openxmlformats.org/markup-compatibility/2006" xmlns:aink="http://schemas.microsoft.com/office/drawing/2016/ink" xmlns:am3d="http://schemas.microsoft.com/office/drawing/2017/model3d" xmlns:o="urn:schemas-microsoft-com:office:office" xmlns:oel="http://schemas.microsoft.com/office/2019/extlst" xmlns:r="http://schemas.openxmlformats.org/officeDocument/2006/relationships" xmlns:m="http://schemas.openxmlformats.org/officeDocument/2006/math" xmlns:v="urn:schemas-microsoft-com:vml" xmlns:wp14="http://schemas.microsoft.com/office/word/2010/wordprocessingDrawing" xmlns:wp="http://schemas.openxmlformats.org/drawingml/2006/wordprocessingDrawing" xmlns:w10="urn:schemas-microsoft-com:office:word" xmlns:w="http://schemas.openxmlformats.org/wordprocessingml/2006/main" xmlns:w14="http://schemas.microsoft.com/office/word/2010/wordml" xmlns:w15="http://schemas.microsoft.com/office/word/2012/wordml" xmlns:w16cex="http://schemas.microsoft.com/office/word/2018/wordml/cex" xmlns:w16cid="http://schemas.microsoft.com/office/word/2016/wordml/cid" xmlns:w16="http://schemas.microsoft.com/office/word/2018/wordml" xmlns:w16du="http://schemas.microsoft.com/office/word/2023/wordml/word16du" xmlns:w16sdtdh="http://schemas.microsoft.com/office/word/2020/wordml/sdtdatahash" xmlns:w16sdtfl="http://schemas.microsoft.com/office/word/2024/wordml/sdtformatlock" xmlns:w16se="http://schemas.microsoft.com/office/word/2015/wordml/symex" xmlns:wpg="http://schemas.microsoft.com/office/word/2010/wordprocessingGroup" xmlns:wpi="http://schemas.microsoft.com/office/word/2010/wordprocessingInk" xmlns:wne="http://schemas.microsoft.com/office/word/2006/wordml" xmlns:wps="http://schemas.microsoft.com/office/word/2010/wordprocessingShape" mc:Ignorable="w14 w15 w16se w16cid w16 w16cex w16sdtdh w16sdtfl w16du wp14">
+  <w:numPicBullet w:numPicBulletId="0">
+    <w:pict>
+      <v:shapetype id="_x0000_t75" coordsize="21600,21600" o:spt="75" o:preferrelative="t" path="m@4@5l@4@11@9@11@9@5xe" filled="f" stroked="f">
+        <v:stroke joinstyle="miter"/>
+        <v:formulas>
+          <v:f eqn="if lineDrawn pixelLineWidth 0"/>
+          <v:f eqn="sum @0 1 0"/>
+          <v:f eqn="sum 0 0 @1"/>
+          <v:f eqn="prod @2 1 2"/>
+          <v:f eqn="prod @3 21600 pixelWidth"/>
+          <v:f eqn="prod @3 21600 pixelHeight"/>
+          <v:f eqn="sum @0 0 1"/>
+          <v:f eqn="prod @6 1 2"/>
+          <v:f eqn="prod @7 21600 pixelWidth"/>
+          <v:f eqn="sum @8 21600 0"/>
+          <v:f eqn="prod @7 21600 pixelHeight"/>
+          <v:f eqn="sum @10 21600 0"/>
+        </v:formulas>
+        <v:path o:extrusionok="f" gradientshapeok="t" o:connecttype="rect"/>
+        <o:lock v:ext="edit" aspectratio="t"/>
+      </v:shapetype>
+      <v:shape id="_x0000_i1025" type="#_x0000_t75" style="width:11.45pt;height:11.45pt" o:bullet="t">
+        <v:imagedata r:id="rId1" o:title="msoD17D"/>
+      </v:shape>
+    </w:pict>
+  </w:numPicBullet>
   <w:abstractNum w:abstractNumId="0" w15:restartNumberingAfterBreak="0">
     <w:nsid w:val="091F0D67"/>
     <w:multiLevelType w:val="hybridMultilevel"/>
@@ -485,8 +831,193 @@
       </w:pPr>
     </w:lvl>
   </w:abstractNum>
+  <w:abstractNum w:abstractNumId="1" w15:restartNumberingAfterBreak="0">
+    <w:nsid w:val="28CC56C9"/>
+    <w:multiLevelType w:val="hybridMultilevel"/>
+    <w:tmpl w:val="134ED968"/>
+    <w:lvl w:ilvl="0" w:tplc="04090011">
+      <w:start w:val="1"/>
+      <w:numFmt w:val="decimal"/>
+      <w:lvlText w:val="%1)"/>
+      <w:lvlJc w:val="left"/>
+      <w:pPr>
+        <w:ind w:left="720" w:hanging="360"/>
+      </w:pPr>
+      <w:rPr>
+        <w:rFonts w:hint="default"/>
+      </w:rPr>
+    </w:lvl>
+    <w:lvl w:ilvl="1" w:tplc="04090019" w:tentative="1">
+      <w:start w:val="1"/>
+      <w:numFmt w:val="lowerLetter"/>
+      <w:lvlText w:val="%2."/>
+      <w:lvlJc w:val="left"/>
+      <w:pPr>
+        <w:ind w:left="1440" w:hanging="360"/>
+      </w:pPr>
+    </w:lvl>
+    <w:lvl w:ilvl="2" w:tplc="0409001B" w:tentative="1">
+      <w:start w:val="1"/>
+      <w:numFmt w:val="lowerRoman"/>
+      <w:lvlText w:val="%3."/>
+      <w:lvlJc w:val="right"/>
+      <w:pPr>
+        <w:ind w:left="2160" w:hanging="180"/>
+      </w:pPr>
+    </w:lvl>
+    <w:lvl w:ilvl="3" w:tplc="0409000F" w:tentative="1">
+      <w:start w:val="1"/>
+      <w:numFmt w:val="decimal"/>
+      <w:lvlText w:val="%4."/>
+      <w:lvlJc w:val="left"/>
+      <w:pPr>
+        <w:ind w:left="2880" w:hanging="360"/>
+      </w:pPr>
+    </w:lvl>
+    <w:lvl w:ilvl="4" w:tplc="04090019" w:tentative="1">
+      <w:start w:val="1"/>
+      <w:numFmt w:val="lowerLetter"/>
+      <w:lvlText w:val="%5."/>
+      <w:lvlJc w:val="left"/>
+      <w:pPr>
+        <w:ind w:left="3600" w:hanging="360"/>
+      </w:pPr>
+    </w:lvl>
+    <w:lvl w:ilvl="5" w:tplc="0409001B" w:tentative="1">
+      <w:start w:val="1"/>
+      <w:numFmt w:val="lowerRoman"/>
+      <w:lvlText w:val="%6."/>
+      <w:lvlJc w:val="right"/>
+      <w:pPr>
+        <w:ind w:left="4320" w:hanging="180"/>
+      </w:pPr>
+    </w:lvl>
+    <w:lvl w:ilvl="6" w:tplc="0409000F" w:tentative="1">
+      <w:start w:val="1"/>
+      <w:numFmt w:val="decimal"/>
+      <w:lvlText w:val="%7."/>
+      <w:lvlJc w:val="left"/>
+      <w:pPr>
+        <w:ind w:left="5040" w:hanging="360"/>
+      </w:pPr>
+    </w:lvl>
+    <w:lvl w:ilvl="7" w:tplc="04090019" w:tentative="1">
+      <w:start w:val="1"/>
+      <w:numFmt w:val="lowerLetter"/>
+      <w:lvlText w:val="%8."/>
+      <w:lvlJc w:val="left"/>
+      <w:pPr>
+        <w:ind w:left="5760" w:hanging="360"/>
+      </w:pPr>
+    </w:lvl>
+    <w:lvl w:ilvl="8" w:tplc="0409001B" w:tentative="1">
+      <w:start w:val="1"/>
+      <w:numFmt w:val="lowerRoman"/>
+      <w:lvlText w:val="%9."/>
+      <w:lvlJc w:val="right"/>
+      <w:pPr>
+        <w:ind w:left="6480" w:hanging="180"/>
+      </w:pPr>
+    </w:lvl>
+  </w:abstractNum>
+  <w:abstractNum w:abstractNumId="2" w15:restartNumberingAfterBreak="0">
+    <w:nsid w:val="5D7354E5"/>
+    <w:multiLevelType w:val="hybridMultilevel"/>
+    <w:tmpl w:val="7492A5C4"/>
+    <w:lvl w:ilvl="0" w:tplc="40090007">
+      <w:start w:val="1"/>
+      <w:numFmt w:val="bullet"/>
+      <w:lvlText w:val=""/>
+      <w:lvlPicBulletId w:val="0"/>
+      <w:lvlJc w:val="left"/>
+      <w:pPr>
+        <w:ind w:left="720" w:hanging="360"/>
+      </w:pPr>
+      <w:rPr>
+        <w:rFonts w:ascii="Symbol" w:hAnsi="Symbol" w:hint="default"/>
+      </w:rPr>
+    </w:lvl>
+    <w:lvl w:ilvl="1" w:tplc="FFFFFFFF" w:tentative="1">
+      <w:start w:val="1"/>
+      <w:numFmt w:val="lowerLetter"/>
+      <w:lvlText w:val="%2."/>
+      <w:lvlJc w:val="left"/>
+      <w:pPr>
+        <w:ind w:left="1440" w:hanging="360"/>
+      </w:pPr>
+    </w:lvl>
+    <w:lvl w:ilvl="2" w:tplc="FFFFFFFF" w:tentative="1">
+      <w:start w:val="1"/>
+      <w:numFmt w:val="lowerRoman"/>
+      <w:lvlText w:val="%3."/>
+      <w:lvlJc w:val="right"/>
+      <w:pPr>
+        <w:ind w:left="2160" w:hanging="180"/>
+      </w:pPr>
+    </w:lvl>
+    <w:lvl w:ilvl="3" w:tplc="FFFFFFFF" w:tentative="1">
+      <w:start w:val="1"/>
+      <w:numFmt w:val="decimal"/>
+      <w:lvlText w:val="%4."/>
+      <w:lvlJc w:val="left"/>
+      <w:pPr>
+        <w:ind w:left="2880" w:hanging="360"/>
+      </w:pPr>
+    </w:lvl>
+    <w:lvl w:ilvl="4" w:tplc="FFFFFFFF" w:tentative="1">
+      <w:start w:val="1"/>
+      <w:numFmt w:val="lowerLetter"/>
+      <w:lvlText w:val="%5."/>
+      <w:lvlJc w:val="left"/>
+      <w:pPr>
+        <w:ind w:left="3600" w:hanging="360"/>
+      </w:pPr>
+    </w:lvl>
+    <w:lvl w:ilvl="5" w:tplc="FFFFFFFF" w:tentative="1">
+      <w:start w:val="1"/>
+      <w:numFmt w:val="lowerRoman"/>
+      <w:lvlText w:val="%6."/>
+      <w:lvlJc w:val="right"/>
+      <w:pPr>
+        <w:ind w:left="4320" w:hanging="180"/>
+      </w:pPr>
+    </w:lvl>
+    <w:lvl w:ilvl="6" w:tplc="FFFFFFFF" w:tentative="1">
+      <w:start w:val="1"/>
+      <w:numFmt w:val="decimal"/>
+      <w:lvlText w:val="%7."/>
+      <w:lvlJc w:val="left"/>
+      <w:pPr>
+        <w:ind w:left="5040" w:hanging="360"/>
+      </w:pPr>
+    </w:lvl>
+    <w:lvl w:ilvl="7" w:tplc="FFFFFFFF" w:tentative="1">
+      <w:start w:val="1"/>
+      <w:numFmt w:val="lowerLetter"/>
+      <w:lvlText w:val="%8."/>
+      <w:lvlJc w:val="left"/>
+      <w:pPr>
+        <w:ind w:left="5760" w:hanging="360"/>
+      </w:pPr>
+    </w:lvl>
+    <w:lvl w:ilvl="8" w:tplc="FFFFFFFF" w:tentative="1">
+      <w:start w:val="1"/>
+      <w:numFmt w:val="lowerRoman"/>
+      <w:lvlText w:val="%9."/>
+      <w:lvlJc w:val="right"/>
+      <w:pPr>
+        <w:ind w:left="6480" w:hanging="180"/>
+      </w:pPr>
+    </w:lvl>
+  </w:abstractNum>
   <w:num w:numId="1" w16cid:durableId="1191650743">
     <w:abstractNumId w:val="0"/>
+  </w:num>
+  <w:num w:numId="2" w16cid:durableId="403189320">
+    <w:abstractNumId w:val="2"/>
+  </w:num>
+  <w:num w:numId="3" w16cid:durableId="1012955447">
+    <w:abstractNumId w:val="1"/>
   </w:num>
 </w:numbering>
 </file>

</xml_diff>